<commit_message>
Modifiaction file updated Web
</commit_message>
<xml_diff>
--- a/Modification.docx
+++ b/Modification.docx
@@ -25,15 +25,7 @@
     </w:p>
     <w:p>
       <w:r>
-        <w:t xml:space="preserve">Change </w:t>
-      </w:r>
-      <w:proofErr w:type="spellStart"/>
-      <w:r>
-        <w:t>FetchType</w:t>
-      </w:r>
-      <w:proofErr w:type="spellEnd"/>
-      <w:r>
-        <w:t xml:space="preserve"> from Eager to Lazy in model/Room</w:t>
+        <w:t>Change FetchType from Eager to Lazy in model/Room</w:t>
       </w:r>
     </w:p>
     <w:p>
@@ -43,45 +35,8 @@
     </w:p>
     <w:p>
       <w:r>
-        <w:t xml:space="preserve">Room create </w:t>
-      </w:r>
-      <w:proofErr w:type="spellStart"/>
-      <w:r>
-        <w:t>krne</w:t>
-      </w:r>
-      <w:proofErr w:type="spellEnd"/>
-      <w:r>
-        <w:t xml:space="preserve"> </w:t>
-      </w:r>
-      <w:proofErr w:type="spellStart"/>
-      <w:r>
-        <w:t>wala</w:t>
-      </w:r>
-      <w:proofErr w:type="spellEnd"/>
-      <w:r>
-        <w:t xml:space="preserve"> </w:t>
-      </w:r>
-      <w:proofErr w:type="spellStart"/>
-      <w:r>
-        <w:t>bnda</w:t>
-      </w:r>
-      <w:proofErr w:type="spellEnd"/>
-      <w:r>
-        <w:t xml:space="preserve"> </w:t>
-      </w:r>
-      <w:proofErr w:type="spellStart"/>
-      <w:r>
-        <w:t>bhi</w:t>
-      </w:r>
-      <w:proofErr w:type="spellEnd"/>
-      <w:r>
-        <w:t xml:space="preserve"> game </w:t>
-      </w:r>
-      <w:proofErr w:type="spellStart"/>
-      <w:r>
-        <w:t>khele</w:t>
-      </w:r>
-      <w:proofErr w:type="spellEnd"/>
+        <w:t>Room create krne wala bnda bhi game khele</w:t>
+      </w:r>
     </w:p>
     <w:p>
       <w:r>
@@ -149,58 +104,10 @@
     </w:p>
     <w:p>
       <w:r>
-        <w:t xml:space="preserve">WebSocket Testing </w:t>
-      </w:r>
-      <w:proofErr w:type="spellStart"/>
-      <w:r>
-        <w:t>bohut</w:t>
-      </w:r>
-      <w:proofErr w:type="spellEnd"/>
-      <w:r>
-        <w:t xml:space="preserve"> slow </w:t>
-      </w:r>
-      <w:proofErr w:type="spellStart"/>
-      <w:r>
-        <w:t>thi</w:t>
-      </w:r>
-      <w:proofErr w:type="spellEnd"/>
-      <w:r>
-        <w:t xml:space="preserve"> (might need some modifications)</w:t>
-      </w:r>
-      <w:r>
-        <w:t xml:space="preserve">- questions </w:t>
-      </w:r>
-      <w:proofErr w:type="spellStart"/>
-      <w:r>
-        <w:t>bhi</w:t>
-      </w:r>
-      <w:proofErr w:type="spellEnd"/>
-      <w:r>
-        <w:t xml:space="preserve"> </w:t>
-      </w:r>
-      <w:proofErr w:type="spellStart"/>
-      <w:r>
-        <w:t>bohut</w:t>
-      </w:r>
-      <w:proofErr w:type="spellEnd"/>
-      <w:r>
-        <w:t xml:space="preserve"> der </w:t>
-      </w:r>
-      <w:proofErr w:type="spellStart"/>
-      <w:r>
-        <w:t>baad</w:t>
-      </w:r>
-      <w:proofErr w:type="spellEnd"/>
-      <w:r>
-        <w:t xml:space="preserve"> aa </w:t>
-      </w:r>
-      <w:proofErr w:type="spellStart"/>
-      <w:r>
-        <w:t>rhy</w:t>
-      </w:r>
-      <w:proofErr w:type="spellEnd"/>
-      <w:r>
-        <w:t xml:space="preserve"> thy.</w:t>
+        <w:t>WebSocket Testing bohut slow thi (might need some modifications)</w:t>
+      </w:r>
+      <w:r>
+        <w:t>- questions bhi bohut der baad aa rhy thy.</w:t>
       </w:r>
     </w:p>
     <w:p>
@@ -222,6 +129,22 @@
           <w:bCs/>
         </w:rPr>
         <w:t>Android Modifications</w:t>
+      </w:r>
+    </w:p>
+    <w:p>
+      <w:pPr>
+        <w:jc w:val="center"/>
+        <w:rPr>
+          <w:b/>
+          <w:bCs/>
+        </w:rPr>
+      </w:pPr>
+      <w:r>
+        <w:rPr>
+          <w:b/>
+          <w:bCs/>
+        </w:rPr>
+        <w:t>Web Modifications</w:t>
       </w:r>
     </w:p>
     <w:sectPr>

</xml_diff>

<commit_message>
Modification file updated IOS
</commit_message>
<xml_diff>
--- a/Modification.docx
+++ b/Modification.docx
@@ -145,6 +145,22 @@
           <w:bCs/>
         </w:rPr>
         <w:t>Web Modifications</w:t>
+      </w:r>
+    </w:p>
+    <w:p>
+      <w:pPr>
+        <w:jc w:val="center"/>
+        <w:rPr>
+          <w:b/>
+          <w:bCs/>
+        </w:rPr>
+      </w:pPr>
+      <w:r>
+        <w:rPr>
+          <w:b/>
+          <w:bCs/>
+        </w:rPr>
+        <w:t>IOS Modifications</w:t>
       </w:r>
     </w:p>
     <w:sectPr>

</xml_diff>